<commit_message>
recover execution materialization interpretation
</commit_message>
<xml_diff>
--- a/docs/IT-039-001 — Operational Materialization Interpretation MVP.docx
+++ b/docs/IT-039-001 — Operational Materialization Interpretation MVP.docx
@@ -95,13 +95,12 @@
           <w:bCs w:val="1"/>
           <w:rtl w:val="0"/>
         </w:rPr>
-        <w:t xml:space="preserve">Capability:</w:t>
-      </w:r>
-      <w:r>
-        <w:rPr>
-          <w:rtl w:val="0"/>
-        </w:rPr>
-        <w:t xml:space="preserve"> Operational Materialization Interpretation</w:t>
+        <w:t xml:space="preserve">Capability propietaria: Execution &amp; Market Connectivity / CAP-007</w:t>
+      </w:r>
+      <w:r>
+        <w:rPr>
+          <w:rtl w:val="0"/>
+        </w:rPr>
         <w:br w:type="textWrapping"/>
       </w:r>
       <w:r>
@@ -110,13 +109,12 @@
           <w:bCs w:val="1"/>
           <w:rtl w:val="0"/>
         </w:rPr>
-        <w:t xml:space="preserve">Documento arquitectónico:</w:t>
-      </w:r>
-      <w:r>
-        <w:rPr>
-          <w:rtl w:val="0"/>
-        </w:rPr>
-        <w:t xml:space="preserve"> DOC-039 — Operational Materialization Interpretation Capability</w:t>
+        <w:t xml:space="preserve">Autoridad arquitectónica: DOC-034 — Execution Capability v1.1</w:t>
+      </w:r>
+      <w:r>
+        <w:rPr>
+          <w:rtl w:val="0"/>
+        </w:rPr>
         <w:br w:type="textWrapping"/>
       </w:r>
       <w:r>
@@ -125,13 +123,12 @@
           <w:bCs w:val="1"/>
           <w:rtl w:val="0"/>
         </w:rPr>
-        <w:t xml:space="preserve">Auditoría de preparación:</w:t>
-      </w:r>
-      <w:r>
-        <w:rPr>
-          <w:rtl w:val="0"/>
-        </w:rPr>
-        <w:t xml:space="preserve"> OA-039-008 — Auditoría de Preparación para IT-039-001</w:t>
+        <w:t xml:space="preserve">Recuperación: DOC-039 / IT-039-001 v1.0 auditados contra DOC-034 v1.1, IT-038-001 v1.1, código vigente y consumidores</w:t>
+      </w:r>
+      <w:r>
+        <w:rPr>
+          <w:rtl w:val="0"/>
+        </w:rPr>
         <w:br w:type="textWrapping"/>
       </w:r>
       <w:r>
@@ -140,13 +137,12 @@
           <w:bCs w:val="1"/>
           <w:rtl w:val="0"/>
         </w:rPr>
-        <w:t xml:space="preserve">Predecesor funcional:</w:t>
-      </w:r>
-      <w:r>
-        <w:rPr>
-          <w:rtl w:val="0"/>
-        </w:rPr>
-        <w:t xml:space="preserve"> IT-038-001 — Operational Materialization MVP</w:t>
+        <w:t xml:space="preserve">Predecesor funcional: IT-038-001 — Execution Operational Materialization Recognition MVP v1.1</w:t>
+      </w:r>
+      <w:r>
+        <w:rPr>
+          <w:rtl w:val="0"/>
+        </w:rPr>
         <w:br w:type="textWrapping"/>
       </w:r>
       <w:r>
@@ -170,13 +166,9 @@
           <w:bCs w:val="1"/>
           <w:rtl w:val="0"/>
         </w:rPr>
-        <w:t xml:space="preserve">Estado:</w:t>
-      </w:r>
-      <w:r>
-        <w:rPr>
-          <w:rtl w:val="0"/>
-        </w:rPr>
-        <w:t xml:space="preserve"> Deprecated</w:t>
+        <w:t xml:space="preserve">Versión: 1.1</w:t>
+        <w:br w:type="textWrapping"/>
+        <w:t xml:space="preserve">Estado: READY FOR IMPLEMENTATION</w:t>
       </w:r>
       <w:r>
         <w:rPr>
@@ -198,26 +190,6 @@
         <w:rPr>
           <w:rtl w:val="0"/>
         </w:rPr>
-      </w:r>
-    </w:p>
-    <w:p>
-      <w:pPr>
-        <w:pStyle w:val="Heading1"/>
-      </w:pPr>
-      <w:r>
-        <w:t>1.1 Disposición vigente de recuperación arquitectónica</w:t>
-      </w:r>
-    </w:p>
-    <w:p>
-      <w:pPr/>
-      <w:r>
-        <w:t>IT-039-001 queda en estado Deprecated y se conserva como evidencia técnica e histórica de un contrato implementado y validado. Su cierre no demuestra por sí mismo una necesidad operacional vigente ni autoriza desarrollo adicional.</w:t>
-      </w:r>
-    </w:p>
-    <w:p>
-      <w:pPr/>
-      <w:r>
-        <w:t>El incremento no es un paso obligatorio entre DOC-038 y DOC-040. El runtime, las pruebas y la demo existentes se preservan sin cambios; una reactivación futura requiere nueva necesidad contractual demostrada y autoridad arquitectónica vigente.</w:t>
       </w:r>
     </w:p>
     <w:p>
@@ -255,21 +227,12 @@
         <w:rPr>
           <w:rtl w:val="0"/>
         </w:rPr>
-        <w:t xml:space="preserve">Materializar el primer incremento técnico completo de </w:t>
-      </w:r>
-      <w:r>
-        <w:rPr>
-          <w:b w:val="1"/>
-          <w:bCs w:val="1"/>
-          <w:rtl w:val="0"/>
-        </w:rPr>
-        <w:t xml:space="preserve">Operational Materialization Interpretation</w:t>
-      </w:r>
-      <w:r>
-        <w:rPr>
-          <w:rtl w:val="0"/>
-        </w:rPr>
-        <w:t xml:space="preserve">.</w:t>
+        <w:t xml:space="preserve">Recuperar dentro de Execution &amp; Market Connectivity el incremento técnico de interpretación cuantitativa conjunta de Operational Materialization.</w:t>
+      </w:r>
+      <w:r>
+        <w:rPr>
+          <w:rtl w:val="0"/>
+        </w:rPr>
       </w:r>
     </w:p>
     <w:p>
@@ -317,7 +280,7 @@
         <w:rPr>
           <w:rtl w:val="0"/>
         </w:rPr>
-        <w:t xml:space="preserve">uno o más OperationalMaterialization</w:t>
+        <w:t xml:space="preserve">uno o más OperationalMaterialization con occurrence_id distintos</w:t>
       </w:r>
     </w:p>
     <w:p>
@@ -577,7 +540,12 @@
         <w:rPr>
           <w:rtl w:val="0"/>
         </w:rPr>
-        <w:t xml:space="preserve">Después de IT-039-001 deberá existir el flujo:</w:t>
+        <w:t xml:space="preserve">Después de IT-039-001 v1.1 deberá permanecer válido el flujo:</w:t>
+      </w:r>
+      <w:r>
+        <w:rPr>
+          <w:rtl w:val="0"/>
+        </w:rPr>
       </w:r>
     </w:p>
     <w:p>
@@ -1014,25 +982,7 @@
           <w:bCs w:val="1"/>
           <w:rtl w:val="0"/>
         </w:rPr>
-        <w:t xml:space="preserve"> a partir de uno o más </w:t>
-      </w:r>
-      <w:r>
-        <w:rPr>
-          <w:rFonts w:ascii="Roboto Mono" w:cs="Roboto Mono" w:eastAsia="Roboto Mono" w:hAnsi="Roboto Mono"/>
-          <w:b w:val="1"/>
-          <w:bCs w:val="1"/>
-          <w:color w:val="188038"/>
-          <w:rtl w:val="0"/>
-        </w:rPr>
-        <w:t xml:space="preserve">OperationalMaterialization</w:t>
-      </w:r>
-      <w:r>
-        <w:rPr>
-          <w:b w:val="1"/>
-          <w:bCs w:val="1"/>
-          <w:rtl w:val="0"/>
-        </w:rPr>
-        <w:t xml:space="preserve"> contractualmente suministrados y correspondientes a dicha operación.</w:t>
+        <w:t xml:space="preserve"> a partir de uno o más OperationalMaterialization con occurrence_id distintos contractualmente suministrados y correspondientes a dicha operación.</w:t>
       </w:r>
     </w:p>
     <w:p>
@@ -1394,6 +1344,18 @@
         <w:rPr>
           <w:rtl w:val="0"/>
         </w:rPr>
+        <w:t xml:space="preserve">occurrence_id</w:t>
+      </w:r>
+    </w:p>
+    <w:p>
+      <w:pPr>
+        <w:spacing w:after="240" w:before="240" w:lineRule="auto"/>
+        <w:rPr/>
+      </w:pPr>
+      <w:r>
+        <w:rPr>
+          <w:rtl w:val="0"/>
+        </w:rPr>
         <w:t xml:space="preserve">operation</w:t>
       </w:r>
     </w:p>
@@ -1465,7 +1427,7 @@
         <w:rPr>
           <w:rtl w:val="0"/>
         </w:rPr>
-        <w:t xml:space="preserve">Para la responsabilidad de DOC-039 son relevantes contractualmente:</w:t>
+        <w:t xml:space="preserve">Para esta responsabilidad de Execution son relevantes contractualmente:</w:t>
       </w:r>
     </w:p>
     <w:p>
@@ -1601,19 +1563,24 @@
           <w:szCs w:val="46"/>
           <w:rtl w:val="0"/>
         </w:rPr>
-        <w:t xml:space="preserve">6. Nuevo activo contractual</w:t>
-      </w:r>
-    </w:p>
-    <w:p>
-      <w:pPr>
-        <w:spacing w:after="240" w:before="240" w:lineRule="auto"/>
-        <w:rPr/>
-      </w:pPr>
-      <w:r>
-        <w:rPr>
-          <w:rtl w:val="0"/>
-        </w:rPr>
-        <w:t xml:space="preserve">El incremento deberá introducir el activo público:</w:t>
+        <w:t xml:space="preserve">6. Activo contractual preservado</w:t>
+      </w:r>
+    </w:p>
+    <w:p>
+      <w:pPr>
+        <w:spacing w:after="240" w:before="240" w:lineRule="auto"/>
+        <w:rPr/>
+      </w:pPr>
+      <w:r>
+        <w:rPr>
+          <w:rtl w:val="0"/>
+        </w:rPr>
+        <w:t xml:space="preserve">El incremento deberá preservar el activo público existente:</w:t>
+      </w:r>
+      <w:r>
+        <w:rPr>
+          <w:rtl w:val="0"/>
+        </w:rPr>
       </w:r>
     </w:p>
     <w:p>
@@ -1684,25 +1651,7 @@
           <w:bCs w:val="1"/>
           <w:rtl w:val="0"/>
         </w:rPr>
-        <w:t xml:space="preserve"> derivada de uno o más </w:t>
-      </w:r>
-      <w:r>
-        <w:rPr>
-          <w:rFonts w:ascii="Roboto Mono" w:cs="Roboto Mono" w:eastAsia="Roboto Mono" w:hAnsi="Roboto Mono"/>
-          <w:b w:val="1"/>
-          <w:bCs w:val="1"/>
-          <w:color w:val="188038"/>
-          <w:rtl w:val="0"/>
-        </w:rPr>
-        <w:t xml:space="preserve">OperationalMaterialization</w:t>
-      </w:r>
-      <w:r>
-        <w:rPr>
-          <w:b w:val="1"/>
-          <w:bCs w:val="1"/>
-          <w:rtl w:val="0"/>
-        </w:rPr>
-        <w:t xml:space="preserve"> suministrados como hechos fuente.</w:t>
+        <w:t xml:space="preserve"> derivada de uno o más OperationalMaterialization con occurrence_id distintos suministrados como hechos fuente.</w:t>
       </w:r>
     </w:p>
     <w:p>
@@ -2010,21 +1959,12 @@
         <w:rPr>
           <w:rtl w:val="0"/>
         </w:rPr>
-        <w:t xml:space="preserve">Además de sus elementos constitutivos mínimos, la interpretación deberá preservar de forma contractualmente determinable qué </w:t>
-      </w:r>
-      <w:r>
-        <w:rPr>
-          <w:rFonts w:ascii="Roboto Mono" w:cs="Roboto Mono" w:eastAsia="Roboto Mono" w:hAnsi="Roboto Mono"/>
-          <w:color w:val="188038"/>
-          <w:rtl w:val="0"/>
-        </w:rPr>
-        <w:t xml:space="preserve">OperationalMaterialization</w:t>
-      </w:r>
-      <w:r>
-        <w:rPr>
-          <w:rtl w:val="0"/>
-        </w:rPr>
-        <w:t xml:space="preserve"> suministrados sustentan su significado.</w:t>
+        <w:t xml:space="preserve">Además de sus elementos constitutivos mínimos, la interpretación deberá preservar de forma contractualmente determinable qué OperationalMaterialization suministrados sustentan su significado. Los hechos fuente completos constituyen provenance suficiente y preservan sus occurrence_id sin introducir un segundo sistema de referencias.</w:t>
+      </w:r>
+      <w:r>
+        <w:rPr>
+          <w:rtl w:val="0"/>
+        </w:rPr>
       </w:r>
     </w:p>
     <w:p>
@@ -2349,7 +2289,12 @@
         <w:rPr>
           <w:rtl w:val="0"/>
         </w:rPr>
-        <w:t xml:space="preserve">El incremento deberá introducir una operación pública que permita solicitar la interpretación.</w:t>
+        <w:t xml:space="preserve">El incremento deberá preservar una operación pública que permita solicitar la interpretación.</w:t>
+      </w:r>
+      <w:r>
+        <w:rPr>
+          <w:rtl w:val="0"/>
+        </w:rPr>
       </w:r>
     </w:p>
     <w:p>
@@ -3333,7 +3278,7 @@
           <w:ilvl w:val="0"/>
           <w:numId w:val="3"/>
         </w:numPr>
-        <w:spacing w:after="240" w:before="0" w:beforeAutospacing="0" w:lineRule="auto"/>
+        <w:spacing w:after="0" w:afterAutospacing="0" w:before="0" w:beforeAutospacing="0" w:lineRule="auto"/>
         <w:ind w:left="720" w:hanging="360"/>
       </w:pPr>
       <w:r>
@@ -3341,34 +3286,6 @@
           <w:rtl w:val="0"/>
         </w:rPr>
         <w:t xml:space="preserve">hechos no suministrados.</w:t>
-      </w:r>
-    </w:p>
-    <w:p>
-      <w:pPr>
-        <w:spacing w:after="240" w:before="240" w:lineRule="auto"/>
-        <w:rPr/>
-      </w:pPr>
-      <w:r>
-        <w:rPr>
-          <w:rtl w:val="0"/>
-        </w:rPr>
-        <w:t xml:space="preserve">DOC-039 e IT-039-001 no definen:</w:t>
-      </w:r>
-    </w:p>
-    <w:p>
-      <w:pPr>
-        <w:numPr>
-          <w:ilvl w:val="0"/>
-          <w:numId w:val="2"/>
-        </w:numPr>
-        <w:spacing w:after="0" w:afterAutospacing="0" w:before="240" w:lineRule="auto"/>
-        <w:ind w:left="720" w:hanging="360"/>
-      </w:pPr>
-      <w:r>
-        <w:rPr>
-          <w:rtl w:val="0"/>
-        </w:rPr>
-        <w:t xml:space="preserve">identidad contractual de ocurrencia;</w:t>
       </w:r>
     </w:p>
     <w:p>
@@ -3384,7 +3301,7 @@
         <w:rPr>
           <w:rtl w:val="0"/>
         </w:rPr>
-        <w:t xml:space="preserve">equivalencia entre representaciones distintas;</w:t>
+        <w:t xml:space="preserve">IT-038-001 v1.1 ya define identidad contractual de ocurrencia mediante occurrence_id. IT-039-001 v1.1 consume esa autoridad y no la redefine. No define:</w:t>
       </w:r>
     </w:p>
     <w:p>
@@ -3400,7 +3317,23 @@
         <w:rPr>
           <w:rtl w:val="0"/>
         </w:rPr>
-        <w:t xml:space="preserve">deduplicación contractual;</w:t>
+        <w:t xml:space="preserve">equivalencia entre representaciones distintas;</w:t>
+      </w:r>
+    </w:p>
+    <w:p>
+      <w:pPr>
+        <w:numPr>
+          <w:ilvl w:val="0"/>
+          <w:numId w:val="2"/>
+        </w:numPr>
+        <w:spacing w:after="0" w:afterAutospacing="0" w:before="0" w:beforeAutospacing="0" w:lineRule="auto"/>
+        <w:ind w:left="720" w:hanging="360"/>
+      </w:pPr>
+      <w:r>
+        <w:rPr>
+          <w:rtl w:val="0"/>
+        </w:rPr>
+        <w:t xml:space="preserve">deduplicación operacional;</w:t>
       </w:r>
     </w:p>
     <w:p>
@@ -3428,7 +3361,7 @@
         <w:rPr>
           <w:rtl w:val="0"/>
         </w:rPr>
-        <w:t xml:space="preserve">El implementador no deberá inventar esas autoridades para satisfacer este incremento.</w:t>
+        <w:t xml:space="preserve">El implementador no deberá inventar autoridades adicionales para satisfacer este incremento.</w:t>
       </w:r>
     </w:p>
     <w:p>
@@ -3946,7 +3879,12 @@
         <w:rPr>
           <w:rtl w:val="0"/>
         </w:rPr>
-        <w:t xml:space="preserve">El incremento deberá introducir una familia pública de error propia de la Capability, semánticamente equivalente a:</w:t>
+        <w:t xml:space="preserve">El incremento deberá preservar una familia pública de error propia de esta responsabilidad de Execution, semánticamente equivalente a:</w:t>
+      </w:r>
+      <w:r>
+        <w:rPr>
+          <w:rtl w:val="0"/>
+        </w:rPr>
       </w:r>
     </w:p>
     <w:p>
@@ -4337,7 +4275,7 @@
           <w:szCs w:val="26"/>
         </w:rPr>
       </w:pPr>
-      <w:bookmarkStart w:colFirst="0" w:colLast="0" w:name="_2858ztqpl3c0" w:id="25"/>
+      <w:bookmarkStart w:colFirst="0" w:colLast="0" w:name="_1aigh68lbpi3" w:id="25"/>
       <w:bookmarkEnd w:id="25"/>
       <w:r>
         <w:rPr>
@@ -4348,19 +4286,102 @@
           <w:szCs w:val="26"/>
           <w:rtl w:val="0"/>
         </w:rPr>
-        <w:t xml:space="preserve">D. No puede producirse una magnitud compatible con las invariantes públicas vigentes</w:t>
-      </w:r>
-    </w:p>
-    <w:p>
-      <w:pPr>
-        <w:spacing w:after="240" w:before="240" w:lineRule="auto"/>
-        <w:rPr/>
-      </w:pPr>
-      <w:r>
-        <w:rPr>
-          <w:rtl w:val="0"/>
-        </w:rPr>
-        <w:t xml:space="preserve">si una entrada contractualmente posible llega a la Capability pero no permite sostener una interpretación válida.</w:t>
+        <w:t xml:space="preserve">D. Se repite una identidad de ocurrencia entre hechos fuente</w:t>
+      </w:r>
+    </w:p>
+    <w:p>
+      <w:pPr>
+        <w:pStyle w:val="Heading3"/>
+        <w:keepNext w:val="0"/>
+        <w:keepLines w:val="0"/>
+        <w:spacing w:before="280" w:lineRule="auto"/>
+        <w:rPr>
+          <w:b w:val="1"/>
+          <w:bCs w:val="1"/>
+          <w:color w:val="000000"/>
+          <w:sz w:val="26"/>
+          <w:szCs w:val="26"/>
+        </w:rPr>
+      </w:pPr>
+      <w:bookmarkStart w:colFirst="0" w:colLast="0" w:name="_y8e8i3crkv2y" w:id="26"/>
+      <w:bookmarkEnd w:id="26"/>
+      <w:r>
+        <w:rPr>
+          <w:b w:val="1"/>
+          <w:bCs w:val="1"/>
+          <w:color w:val="000000"/>
+          <w:sz w:val="26"/>
+          <w:szCs w:val="26"/>
+          <w:rtl w:val="0"/>
+        </w:rPr>
+        <w:t xml:space="preserve">Dos o más fuentes con el mismo occurrence_id no representan 1..N ocurrencias distintas y deberán producir error de dominio. La responsabilidad no deberá eliminar silenciosamente duplicados ni sumar repetidamente la misma ocurrencia identificada.</w:t>
+      </w:r>
+    </w:p>
+    <w:p>
+      <w:pPr>
+        <w:pStyle w:val="Heading3"/>
+        <w:keepNext w:val="0"/>
+        <w:keepLines w:val="0"/>
+        <w:spacing w:before="280" w:lineRule="auto"/>
+        <w:rPr>
+          <w:b w:val="1"/>
+          <w:bCs w:val="1"/>
+          <w:color w:val="000000"/>
+          <w:sz w:val="26"/>
+          <w:szCs w:val="26"/>
+        </w:rPr>
+      </w:pPr>
+      <w:bookmarkStart w:colFirst="0" w:colLast="0" w:name="_onv6qsa8eddk" w:id="27"/>
+      <w:bookmarkEnd w:id="27"/>
+      <w:r>
+        <w:rPr>
+          <w:rtl w:val="0"/>
+        </w:rPr>
+      </w:r>
+    </w:p>
+    <w:p>
+      <w:pPr>
+        <w:pStyle w:val="Heading3"/>
+        <w:keepNext w:val="0"/>
+        <w:keepLines w:val="0"/>
+        <w:spacing w:before="280" w:lineRule="auto"/>
+        <w:rPr>
+          <w:b w:val="1"/>
+          <w:bCs w:val="1"/>
+          <w:color w:val="000000"/>
+          <w:sz w:val="26"/>
+          <w:szCs w:val="26"/>
+        </w:rPr>
+      </w:pPr>
+      <w:bookmarkStart w:colFirst="0" w:colLast="0" w:name="_2858ztqpl3c0" w:id="28"/>
+      <w:bookmarkEnd w:id="28"/>
+      <w:r>
+        <w:rPr>
+          <w:b w:val="1"/>
+          <w:bCs w:val="1"/>
+          <w:color w:val="000000"/>
+          <w:sz w:val="26"/>
+          <w:szCs w:val="26"/>
+          <w:rtl w:val="0"/>
+        </w:rPr>
+        <w:t xml:space="preserve">E. No puede producirse una magnitud compatible con las invariantes públicas vigentes</w:t>
+      </w:r>
+    </w:p>
+    <w:p>
+      <w:pPr>
+        <w:spacing w:after="240" w:before="240" w:lineRule="auto"/>
+        <w:rPr/>
+      </w:pPr>
+      <w:r>
+        <w:rPr>
+          <w:rtl w:val="0"/>
+        </w:rPr>
+        <w:t xml:space="preserve">si una entrada contractualmente posible llega a esta responsabilidad pero no permite sostener una interpretación válida.</w:t>
+      </w:r>
+      <w:r>
+        <w:rPr>
+          <w:rtl w:val="0"/>
+        </w:rPr>
       </w:r>
     </w:p>
     <w:p>
@@ -4404,8 +4425,8 @@
           <w:szCs w:val="46"/>
         </w:rPr>
       </w:pPr>
-      <w:bookmarkStart w:colFirst="0" w:colLast="0" w:name="_1gt3nrysb444" w:id="26"/>
-      <w:bookmarkEnd w:id="26"/>
+      <w:bookmarkStart w:colFirst="0" w:colLast="0" w:name="_1gt3nrysb444" w:id="29"/>
+      <w:bookmarkEnd w:id="29"/>
       <w:r>
         <w:rPr>
           <w:rFonts w:ascii="Arial Unicode MS" w:cs="Arial Unicode MS" w:eastAsia="Arial Unicode MS" w:hAnsi="Arial Unicode MS"/>
@@ -4474,7 +4495,7 @@
         <w:rPr>
           <w:rtl w:val="0"/>
         </w:rPr>
-        <w:t xml:space="preserve">En DOC-039:</w:t>
+        <w:t xml:space="preserve">En esta responsabilidad:</w:t>
       </w:r>
     </w:p>
     <w:p>
@@ -4588,8 +4609,8 @@
           <w:szCs w:val="46"/>
         </w:rPr>
       </w:pPr>
-      <w:bookmarkStart w:colFirst="0" w:colLast="0" w:name="_1hwddfyleo9p" w:id="27"/>
-      <w:bookmarkEnd w:id="27"/>
+      <w:bookmarkStart w:colFirst="0" w:colLast="0" w:name="_1hwddfyleo9p" w:id="30"/>
+      <w:bookmarkEnd w:id="30"/>
       <w:r>
         <w:rPr>
           <w:b w:val="1"/>
@@ -4645,7 +4666,7 @@
         <w:rPr>
           <w:rtl w:val="0"/>
         </w:rPr>
-        <w:t xml:space="preserve">como invariante de DOC-039.</w:t>
+        <w:t xml:space="preserve">como invariante de IT-039-001 v1.1.</w:t>
       </w:r>
     </w:p>
     <w:p>
@@ -4706,7 +4727,7 @@
         <w:rPr>
           <w:rtl w:val="0"/>
         </w:rPr>
-        <w:t xml:space="preserve">la Capability deberá preservar fielmente la interpretación cuantitativa.</w:t>
+        <w:t xml:space="preserve">Execution deberá preservar fielmente la interpretación cuantitativa.</w:t>
       </w:r>
     </w:p>
     <w:p>
@@ -4821,8 +4842,8 @@
           <w:szCs w:val="46"/>
         </w:rPr>
       </w:pPr>
-      <w:bookmarkStart w:colFirst="0" w:colLast="0" w:name="_lvahwrwuue23" w:id="28"/>
-      <w:bookmarkEnd w:id="28"/>
+      <w:bookmarkStart w:colFirst="0" w:colLast="0" w:name="_lvahwrwuue23" w:id="31"/>
+      <w:bookmarkEnd w:id="31"/>
       <w:r>
         <w:rPr>
           <w:b w:val="1"/>
@@ -4985,7 +5006,7 @@
         <w:rPr>
           <w:rtl w:val="0"/>
         </w:rPr>
-        <w:t xml:space="preserve">La responsabilidad cuantitativa de DOC-039 no requiere interpretar conjuntamente precios.</w:t>
+        <w:t xml:space="preserve">La responsabilidad cuantitativa recuperada no requiere interpretar conjuntamente precios.</w:t>
       </w:r>
     </w:p>
     <w:p>
@@ -5017,8 +5038,8 @@
           <w:szCs w:val="46"/>
         </w:rPr>
       </w:pPr>
-      <w:bookmarkStart w:colFirst="0" w:colLast="0" w:name="_k0e82tlkxxmw" w:id="29"/>
-      <w:bookmarkEnd w:id="29"/>
+      <w:bookmarkStart w:colFirst="0" w:colLast="0" w:name="_k0e82tlkxxmw" w:id="32"/>
+      <w:bookmarkEnd w:id="32"/>
       <w:r>
         <w:rPr>
           <w:b w:val="1"/>
@@ -5225,8 +5246,8 @@
           <w:szCs w:val="46"/>
         </w:rPr>
       </w:pPr>
-      <w:bookmarkStart w:colFirst="0" w:colLast="0" w:name="_a3f5ajjeqqhk" w:id="30"/>
-      <w:bookmarkEnd w:id="30"/>
+      <w:bookmarkStart w:colFirst="0" w:colLast="0" w:name="_a3f5ajjeqqhk" w:id="33"/>
+      <w:bookmarkEnd w:id="33"/>
       <w:r>
         <w:rPr>
           <w:b w:val="1"/>
@@ -5329,7 +5350,7 @@
         <w:rPr>
           <w:rtl w:val="0"/>
         </w:rPr>
-        <w:t xml:space="preserve">no convierte la diferencia entre ambas en responsabilidad de esta Capability.</w:t>
+        <w:t xml:space="preserve">no convierte la diferencia entre ambas en responsabilidad de este incremento.</w:t>
       </w:r>
     </w:p>
     <w:p>
@@ -5361,8 +5382,8 @@
           <w:szCs w:val="46"/>
         </w:rPr>
       </w:pPr>
-      <w:bookmarkStart w:colFirst="0" w:colLast="0" w:name="_pzutradk6gik" w:id="31"/>
-      <w:bookmarkEnd w:id="31"/>
+      <w:bookmarkStart w:colFirst="0" w:colLast="0" w:name="_pzutradk6gik" w:id="34"/>
+      <w:bookmarkEnd w:id="34"/>
       <w:r>
         <w:rPr>
           <w:b w:val="1"/>
@@ -5560,8 +5581,8 @@
           <w:szCs w:val="46"/>
         </w:rPr>
       </w:pPr>
-      <w:bookmarkStart w:colFirst="0" w:colLast="0" w:name="_fphvqchn5p0g" w:id="32"/>
-      <w:bookmarkEnd w:id="32"/>
+      <w:bookmarkStart w:colFirst="0" w:colLast="0" w:name="_fphvqchn5p0g" w:id="35"/>
+      <w:bookmarkEnd w:id="35"/>
       <w:r>
         <w:rPr>
           <w:b w:val="1"/>
@@ -5654,7 +5675,7 @@
         <w:rPr>
           <w:rtl w:val="0"/>
         </w:rPr>
-        <w:t xml:space="preserve">No deberá requerir una Reconciliation Capability.</w:t>
+        <w:t xml:space="preserve">No deberá requerir Reconciliation para producir la interpretación.</w:t>
       </w:r>
     </w:p>
     <w:p>
@@ -5686,8 +5707,8 @@
           <w:szCs w:val="46"/>
         </w:rPr>
       </w:pPr>
-      <w:bookmarkStart w:colFirst="0" w:colLast="0" w:name="_1vi3gkc3zj1z" w:id="33"/>
-      <w:bookmarkEnd w:id="33"/>
+      <w:bookmarkStart w:colFirst="0" w:colLast="0" w:name="_1vi3gkc3zj1z" w:id="36"/>
+      <w:bookmarkEnd w:id="36"/>
       <w:r>
         <w:rPr>
           <w:b w:val="1"/>
@@ -5936,7 +5957,7 @@
         <w:rPr>
           <w:rtl w:val="0"/>
         </w:rPr>
-        <w:t xml:space="preserve">OA-039-008 no identificó tal necesidad.</w:t>
+        <w:t xml:space="preserve">La auditoría de recuperación de IT-039-001 v1.1 no identificó tal necesidad.</w:t>
       </w:r>
     </w:p>
     <w:p>
@@ -5968,8 +5989,8 @@
           <w:szCs w:val="46"/>
         </w:rPr>
       </w:pPr>
-      <w:bookmarkStart w:colFirst="0" w:colLast="0" w:name="_n64blhl38uym" w:id="34"/>
-      <w:bookmarkEnd w:id="34"/>
+      <w:bookmarkStart w:colFirst="0" w:colLast="0" w:name="_n64blhl38uym" w:id="37"/>
+      <w:bookmarkEnd w:id="37"/>
       <w:r>
         <w:rPr>
           <w:b w:val="1"/>
@@ -6073,7 +6094,7 @@
         <w:rPr>
           <w:rtl w:val="0"/>
         </w:rPr>
-        <w:t xml:space="preserve">La inmutabilidad de la interpretación deberá poder demostrarse sin convertir almacenamiento en responsabilidad de DOC-039.</w:t>
+        <w:t xml:space="preserve">La inmutabilidad de la interpretación deberá poder demostrarse sin convertir almacenamiento en responsabilidad de este incremento.</w:t>
       </w:r>
     </w:p>
     <w:p>
@@ -6105,8 +6126,8 @@
           <w:szCs w:val="46"/>
         </w:rPr>
       </w:pPr>
-      <w:bookmarkStart w:colFirst="0" w:colLast="0" w:name="_vdo3by3wwqk3" w:id="35"/>
-      <w:bookmarkEnd w:id="35"/>
+      <w:bookmarkStart w:colFirst="0" w:colLast="0" w:name="_vdo3by3wwqk3" w:id="38"/>
+      <w:bookmarkEnd w:id="38"/>
       <w:r>
         <w:rPr>
           <w:b w:val="1"/>
@@ -6242,8 +6263,8 @@
           <w:szCs w:val="46"/>
         </w:rPr>
       </w:pPr>
-      <w:bookmarkStart w:colFirst="0" w:colLast="0" w:name="_gfhu4xfddliy" w:id="36"/>
-      <w:bookmarkEnd w:id="36"/>
+      <w:bookmarkStart w:colFirst="0" w:colLast="0" w:name="_gfhu4xfddliy" w:id="39"/>
+      <w:bookmarkEnd w:id="39"/>
       <w:r>
         <w:rPr>
           <w:b w:val="1"/>
@@ -6369,8 +6390,8 @@
           <w:szCs w:val="46"/>
         </w:rPr>
       </w:pPr>
-      <w:bookmarkStart w:colFirst="0" w:colLast="0" w:name="_n22fyhubvzm3" w:id="37"/>
-      <w:bookmarkEnd w:id="37"/>
+      <w:bookmarkStart w:colFirst="0" w:colLast="0" w:name="_n22fyhubvzm3" w:id="40"/>
+      <w:bookmarkEnd w:id="40"/>
       <w:r>
         <w:rPr>
           <w:b w:val="1"/>
@@ -6593,7 +6614,7 @@
         <w:rPr>
           <w:rtl w:val="0"/>
         </w:rPr>
-        <w:t xml:space="preserve">la responsabilidad de DOC-039 debe poder cumplirse sin reconstruir el flujo anterior.</w:t>
+        <w:t xml:space="preserve">la responsabilidad de Materialization Interpretation debe poder cumplirse sin reconstruir el flujo anterior.</w:t>
       </w:r>
     </w:p>
     <w:p>
@@ -6625,8 +6646,8 @@
           <w:szCs w:val="46"/>
         </w:rPr>
       </w:pPr>
-      <w:bookmarkStart w:colFirst="0" w:colLast="0" w:name="_mf8k5tfebuge" w:id="38"/>
-      <w:bookmarkEnd w:id="38"/>
+      <w:bookmarkStart w:colFirst="0" w:colLast="0" w:name="_mf8k5tfebuge" w:id="41"/>
+      <w:bookmarkEnd w:id="41"/>
       <w:r>
         <w:rPr>
           <w:b w:val="1"/>
@@ -6754,7 +6775,7 @@
         <w:rPr>
           <w:rtl w:val="0"/>
         </w:rPr>
-        <w:t xml:space="preserve">La Capability deberá incorporarse como consumidor de contratos existentes.</w:t>
+        <w:t xml:space="preserve">La responsabilidad deberá permanecer como consumidora de contratos existentes dentro de Execution.</w:t>
       </w:r>
     </w:p>
     <w:p>
@@ -6798,8 +6819,8 @@
           <w:szCs w:val="46"/>
         </w:rPr>
       </w:pPr>
-      <w:bookmarkStart w:colFirst="0" w:colLast="0" w:name="_pw7w4lsiybxy" w:id="39"/>
-      <w:bookmarkEnd w:id="39"/>
+      <w:bookmarkStart w:colFirst="0" w:colLast="0" w:name="_pw7w4lsiybxy" w:id="42"/>
+      <w:bookmarkEnd w:id="42"/>
       <w:r>
         <w:rPr>
           <w:b w:val="1"/>
@@ -6901,7 +6922,7 @@
         <w:rPr>
           <w:rtl w:val="0"/>
         </w:rPr>
-        <w:t xml:space="preserve">Los nombres exactos pueden variar si las convenciones reales del repositorio justifican otra formulación equivalente.</w:t>
+        <w:t xml:space="preserve">Los nombres públicos existentes deberán preservarse salvo que una incompatibilidad contractual demostrada exija otra formulación equivalente.</w:t>
       </w:r>
     </w:p>
     <w:p>
@@ -7085,8 +7106,8 @@
           <w:szCs w:val="46"/>
         </w:rPr>
       </w:pPr>
-      <w:bookmarkStart w:colFirst="0" w:colLast="0" w:name="_ryj5a1rehivp" w:id="40"/>
-      <w:bookmarkEnd w:id="40"/>
+      <w:bookmarkStart w:colFirst="0" w:colLast="0" w:name="_ryj5a1rehivp" w:id="43"/>
+      <w:bookmarkEnd w:id="43"/>
       <w:r>
         <w:rPr>
           <w:b w:val="1"/>
@@ -7375,8 +7396,8 @@
           <w:szCs w:val="46"/>
         </w:rPr>
       </w:pPr>
-      <w:bookmarkStart w:colFirst="0" w:colLast="0" w:name="_24s2x6lmesqr" w:id="41"/>
-      <w:bookmarkEnd w:id="41"/>
+      <w:bookmarkStart w:colFirst="0" w:colLast="0" w:name="_24s2x6lmesqr" w:id="44"/>
+      <w:bookmarkEnd w:id="44"/>
       <w:r>
         <w:rPr>
           <w:b w:val="1"/>
@@ -7409,67 +7430,67 @@
         <w:rPr>
           <w:rtl w:val="0"/>
         </w:rPr>
-        <w:t xml:space="preserve">occurrence_id</w:t>
-      </w:r>
-    </w:p>
-    <w:p>
-      <w:pPr>
-        <w:spacing w:after="240" w:before="240" w:lineRule="auto"/>
-        <w:rPr/>
-      </w:pPr>
-      <w:r>
-        <w:rPr>
-          <w:rtl w:val="0"/>
-        </w:rPr>
-        <w:t xml:space="preserve">materialization_id</w:t>
-      </w:r>
-    </w:p>
-    <w:p>
-      <w:pPr>
-        <w:spacing w:after="240" w:before="240" w:lineRule="auto"/>
-        <w:rPr/>
-      </w:pPr>
-      <w:r>
-        <w:rPr>
-          <w:rtl w:val="0"/>
-        </w:rPr>
-        <w:t xml:space="preserve">broker_execution_id</w:t>
-      </w:r>
-    </w:p>
-    <w:p>
-      <w:pPr>
-        <w:spacing w:after="240" w:before="240" w:lineRule="auto"/>
-        <w:rPr/>
-      </w:pPr>
-      <w:r>
-        <w:rPr>
-          <w:rtl w:val="0"/>
-        </w:rPr>
-        <w:t xml:space="preserve">deduplication authority</w:t>
-      </w:r>
-    </w:p>
-    <w:p>
-      <w:pPr>
-        <w:spacing w:after="240" w:before="240" w:lineRule="auto"/>
-        <w:rPr/>
-      </w:pPr>
-      <w:r>
-        <w:rPr>
-          <w:rtl w:val="0"/>
-        </w:rPr>
-        <w:t xml:space="preserve">hash identity</w:t>
-      </w:r>
-    </w:p>
-    <w:p>
-      <w:pPr>
-        <w:spacing w:after="240" w:before="240" w:lineRule="auto"/>
-        <w:rPr/>
-      </w:pPr>
-      <w:r>
-        <w:rPr>
-          <w:rtl w:val="0"/>
-        </w:rPr>
-        <w:t xml:space="preserve">canonical identity</w:t>
+        <w:t xml:space="preserve">una nueva identidad de ocurrencia distinta de occurrence_id;</w:t>
+      </w:r>
+    </w:p>
+    <w:p>
+      <w:pPr>
+        <w:spacing w:after="240" w:before="240" w:lineRule="auto"/>
+        <w:rPr/>
+      </w:pPr>
+      <w:r>
+        <w:rPr>
+          <w:rtl w:val="0"/>
+        </w:rPr>
+        <w:t xml:space="preserve">materialization_id adicional;</w:t>
+      </w:r>
+    </w:p>
+    <w:p>
+      <w:pPr>
+        <w:spacing w:after="240" w:before="240" w:lineRule="auto"/>
+        <w:rPr/>
+      </w:pPr>
+      <w:r>
+        <w:rPr>
+          <w:rtl w:val="0"/>
+        </w:rPr>
+        <w:t xml:space="preserve">broker_execution_id como identidad de dominio;</w:t>
+      </w:r>
+    </w:p>
+    <w:p>
+      <w:pPr>
+        <w:spacing w:after="240" w:before="240" w:lineRule="auto"/>
+        <w:rPr/>
+      </w:pPr>
+      <w:r>
+        <w:rPr>
+          <w:rtl w:val="0"/>
+        </w:rPr>
+        <w:t xml:space="preserve">deduplication authority operacional;</w:t>
+      </w:r>
+    </w:p>
+    <w:p>
+      <w:pPr>
+        <w:spacing w:after="240" w:before="240" w:lineRule="auto"/>
+        <w:rPr/>
+      </w:pPr>
+      <w:r>
+        <w:rPr>
+          <w:rtl w:val="0"/>
+        </w:rPr>
+        <w:t xml:space="preserve">hash identity;</w:t>
+      </w:r>
+    </w:p>
+    <w:p>
+      <w:pPr>
+        <w:spacing w:after="240" w:before="240" w:lineRule="auto"/>
+        <w:rPr/>
+      </w:pPr>
+      <w:r>
+        <w:rPr>
+          <w:rtl w:val="0"/>
+        </w:rPr>
+        <w:t xml:space="preserve">canonical identity;</w:t>
       </w:r>
     </w:p>
     <w:p>
@@ -7483,6 +7504,11 @@
         </w:rPr>
         <w:t xml:space="preserve">exactly-once semantics</w:t>
       </w:r>
+      <w:r>
+        <w:rPr>
+          <w:rtl w:val="0"/>
+        </w:rPr>
+      </w:r>
     </w:p>
     <w:p>
       <w:pPr>
@@ -7516,7 +7542,7 @@
         <w:rPr>
           <w:rtl w:val="0"/>
         </w:rPr>
-        <w:t xml:space="preserve">Tampoco deberá convertir igualdad estructural o identidad de objeto en identidad contractual de ocurrencia.</w:t>
+        <w:t xml:space="preserve">Tampoco deberá sustituir occurrence_id por igualdad estructural o identidad de objeto. La unicidad de occurrence_id entre las fuentes consideradas es una precondición contractual de la interpretación, no una autorización para diseñar un subsistema de deduplicación.</w:t>
       </w:r>
     </w:p>
     <w:p>
@@ -7548,8 +7574,8 @@
           <w:szCs w:val="46"/>
         </w:rPr>
       </w:pPr>
-      <w:bookmarkStart w:colFirst="0" w:colLast="0" w:name="_wgz137y2f4jw" w:id="42"/>
-      <w:bookmarkEnd w:id="42"/>
+      <w:bookmarkStart w:colFirst="0" w:colLast="0" w:name="_wgz137y2f4jw" w:id="45"/>
+      <w:bookmarkEnd w:id="45"/>
       <w:r>
         <w:rPr>
           <w:b w:val="1"/>
@@ -7586,8 +7612,8 @@
           <w:szCs w:val="34"/>
         </w:rPr>
       </w:pPr>
-      <w:bookmarkStart w:colFirst="0" w:colLast="0" w:name="_4y53p1qi394c" w:id="43"/>
-      <w:bookmarkEnd w:id="43"/>
+      <w:bookmarkStart w:colFirst="0" w:colLast="0" w:name="_4y53p1qi394c" w:id="46"/>
+      <w:bookmarkEnd w:id="46"/>
       <w:r>
         <w:rPr>
           <w:b w:val="1"/>
@@ -7722,8 +7748,8 @@
           <w:szCs w:val="34"/>
         </w:rPr>
       </w:pPr>
-      <w:bookmarkStart w:colFirst="0" w:colLast="0" w:name="_i5s9c4cexukc" w:id="44"/>
-      <w:bookmarkEnd w:id="44"/>
+      <w:bookmarkStart w:colFirst="0" w:colLast="0" w:name="_i5s9c4cexukc" w:id="47"/>
+      <w:bookmarkEnd w:id="47"/>
       <w:r>
         <w:rPr>
           <w:b w:val="1"/>
@@ -7858,8 +7884,8 @@
           <w:szCs w:val="34"/>
         </w:rPr>
       </w:pPr>
-      <w:bookmarkStart w:colFirst="0" w:colLast="0" w:name="_qg35twwnd6f7" w:id="45"/>
-      <w:bookmarkEnd w:id="45"/>
+      <w:bookmarkStart w:colFirst="0" w:colLast="0" w:name="_qg35twwnd6f7" w:id="48"/>
+      <w:bookmarkEnd w:id="48"/>
       <w:r>
         <w:rPr>
           <w:b w:val="1"/>
@@ -7938,8 +7964,8 @@
           <w:szCs w:val="34"/>
         </w:rPr>
       </w:pPr>
-      <w:bookmarkStart w:colFirst="0" w:colLast="0" w:name="_avnenwwblqxo" w:id="46"/>
-      <w:bookmarkEnd w:id="46"/>
+      <w:bookmarkStart w:colFirst="0" w:colLast="0" w:name="_avnenwwblqxo" w:id="49"/>
+      <w:bookmarkEnd w:id="49"/>
       <w:r>
         <w:rPr>
           <w:b w:val="1"/>
@@ -7992,8 +8018,8 @@
           <w:szCs w:val="34"/>
         </w:rPr>
       </w:pPr>
-      <w:bookmarkStart w:colFirst="0" w:colLast="0" w:name="_gqtklqpksqd6" w:id="47"/>
-      <w:bookmarkEnd w:id="47"/>
+      <w:bookmarkStart w:colFirst="0" w:colLast="0" w:name="_gqtklqpksqd6" w:id="50"/>
+      <w:bookmarkEnd w:id="50"/>
       <w:r>
         <w:rPr>
           <w:b w:val="1"/>
@@ -8046,8 +8072,8 @@
           <w:szCs w:val="34"/>
         </w:rPr>
       </w:pPr>
-      <w:bookmarkStart w:colFirst="0" w:colLast="0" w:name="_bb2d91hx101p" w:id="48"/>
-      <w:bookmarkEnd w:id="48"/>
+      <w:bookmarkStart w:colFirst="0" w:colLast="0" w:name="_bb2d91hx101p" w:id="51"/>
+      <w:bookmarkEnd w:id="51"/>
       <w:r>
         <w:rPr>
           <w:b w:val="1"/>
@@ -8100,8 +8126,8 @@
           <w:szCs w:val="34"/>
         </w:rPr>
       </w:pPr>
-      <w:bookmarkStart w:colFirst="0" w:colLast="0" w:name="_zdmzk09y16d0" w:id="49"/>
-      <w:bookmarkEnd w:id="49"/>
+      <w:bookmarkStart w:colFirst="0" w:colLast="0" w:name="_zdmzk09y16d0" w:id="52"/>
+      <w:bookmarkEnd w:id="52"/>
       <w:r>
         <w:rPr>
           <w:b w:val="1"/>
@@ -8212,8 +8238,8 @@
           <w:szCs w:val="34"/>
         </w:rPr>
       </w:pPr>
-      <w:bookmarkStart w:colFirst="0" w:colLast="0" w:name="_vra1wzcd4jg8" w:id="50"/>
-      <w:bookmarkEnd w:id="50"/>
+      <w:bookmarkStart w:colFirst="0" w:colLast="0" w:name="_a0xwf4sbnayl" w:id="53"/>
+      <w:bookmarkEnd w:id="53"/>
       <w:r>
         <w:rPr>
           <w:b w:val="1"/>
@@ -8222,35 +8248,7 @@
           <w:szCs w:val="34"/>
           <w:rtl w:val="0"/>
         </w:rPr>
-        <w:t xml:space="preserve">T-039-008 — No mutación</w:t>
-      </w:r>
-    </w:p>
-    <w:p>
-      <w:pPr>
-        <w:spacing w:after="240" w:before="240" w:lineRule="auto"/>
-        <w:rPr/>
-      </w:pPr>
-      <w:r>
-        <w:rPr>
-          <w:rtl w:val="0"/>
-        </w:rPr>
-        <w:t xml:space="preserve">Después de producir una interpretación, la operación y los hechos fuente deberán conservar sus valores contractuales.</w:t>
-      </w:r>
-    </w:p>
-    <w:p>
-      <w:pPr>
-        <w:spacing w:after="240" w:before="240" w:lineRule="auto"/>
-        <w:rPr/>
-      </w:pPr>
-      <w:r>
-        <w:pict>
-          <v:rect style="width:0.0pt;height:1.5pt" o:hr="t" o:hrstd="t" o:hralign="center" fillcolor="#A0A0A0" stroked="f"/>
-        </w:pict>
-      </w:r>
-      <w:r>
-        <w:rPr>
-          <w:rtl w:val="0"/>
-        </w:rPr>
+        <w:t xml:space="preserve">T-039-008 — Identidad de ocurrencia repetida</w:t>
       </w:r>
     </w:p>
     <w:p>
@@ -8266,8 +8264,8 @@
           <w:szCs w:val="34"/>
         </w:rPr>
       </w:pPr>
-      <w:bookmarkStart w:colFirst="0" w:colLast="0" w:name="_cwkx3zyk9v9b" w:id="51"/>
-      <w:bookmarkEnd w:id="51"/>
+      <w:bookmarkStart w:colFirst="0" w:colLast="0" w:name="_nwn64v6cymxw" w:id="54"/>
+      <w:bookmarkEnd w:id="54"/>
       <w:r>
         <w:rPr>
           <w:b w:val="1"/>
@@ -8276,82 +8274,7 @@
           <w:szCs w:val="34"/>
           <w:rtl w:val="0"/>
         </w:rPr>
-        <w:t xml:space="preserve">T-039-009 — Interpretaciones sucesivas</w:t>
-      </w:r>
-    </w:p>
-    <w:p>
-      <w:pPr>
-        <w:spacing w:after="240" w:before="240" w:lineRule="auto"/>
-        <w:rPr/>
-      </w:pPr>
-      <w:r>
-        <w:rPr>
-          <w:rtl w:val="0"/>
-        </w:rPr>
-        <w:t xml:space="preserve">Dadas:</w:t>
-      </w:r>
-    </w:p>
-    <w:p>
-      <w:pPr>
-        <w:spacing w:after="240" w:before="240" w:lineRule="auto"/>
-        <w:rPr/>
-      </w:pPr>
-      <w:r>
-        <w:rPr>
-          <w:rtl w:val="0"/>
-        </w:rPr>
-        <w:t xml:space="preserve">D1 from {M1}</w:t>
-      </w:r>
-    </w:p>
-    <w:p>
-      <w:pPr>
-        <w:spacing w:after="240" w:before="240" w:lineRule="auto"/>
-        <w:rPr/>
-      </w:pPr>
-      <w:r>
-        <w:rPr>
-          <w:rtl w:val="0"/>
-        </w:rPr>
-        <w:t xml:space="preserve">D2 from {M1, M2}</w:t>
-      </w:r>
-    </w:p>
-    <w:p>
-      <w:pPr>
-        <w:spacing w:after="240" w:before="240" w:lineRule="auto"/>
-        <w:rPr/>
-      </w:pPr>
-      <w:r>
-        <w:rPr>
-          <w:rtl w:val="0"/>
-        </w:rPr>
-      </w:r>
-    </w:p>
-    <w:p>
-      <w:pPr>
-        <w:spacing w:after="240" w:before="240" w:lineRule="auto"/>
-        <w:rPr/>
-      </w:pPr>
-      <w:r>
-        <w:rPr>
-          <w:rtl w:val="0"/>
-        </w:rPr>
-        <w:t xml:space="preserve">deberá demostrarse que D1 conserva su significado original después de construir D2.</w:t>
-      </w:r>
-    </w:p>
-    <w:p>
-      <w:pPr>
-        <w:spacing w:after="240" w:before="240" w:lineRule="auto"/>
-        <w:rPr/>
-      </w:pPr>
-      <w:r>
-        <w:pict>
-          <v:rect style="width:0.0pt;height:1.5pt" o:hr="t" o:hrstd="t" o:hralign="center" fillcolor="#A0A0A0" stroked="f"/>
-        </w:pict>
-      </w:r>
-      <w:r>
-        <w:rPr>
-          <w:rtl w:val="0"/>
-        </w:rPr>
+        <w:t xml:space="preserve">Dos OperationalMaterialization de la misma operación con el mismo occurrence_id deberán producir OperationalMaterializationInterpretationDomainError; no deberán deduplicarse silenciosamente ni contarse dos veces.</w:t>
       </w:r>
     </w:p>
     <w:p>
@@ -8367,17 +8290,193 @@
           <w:szCs w:val="34"/>
         </w:rPr>
       </w:pPr>
-      <w:bookmarkStart w:colFirst="0" w:colLast="0" w:name="_m8htobx9wjuq" w:id="52"/>
-      <w:bookmarkEnd w:id="52"/>
-      <w:r>
+      <w:bookmarkStart w:colFirst="0" w:colLast="0" w:name="_5b67d0ialyj6" w:id="55"/>
+      <w:bookmarkEnd w:id="55"/>
+      <w:r>
+        <w:rPr>
+          <w:rtl w:val="0"/>
+        </w:rPr>
+      </w:r>
+    </w:p>
+    <w:p>
+      <w:pPr>
+        <w:pStyle w:val="Heading2"/>
+        <w:keepNext w:val="0"/>
+        <w:keepLines w:val="0"/>
+        <w:spacing w:after="80" w:lineRule="auto"/>
         <w:rPr>
           <w:b w:val="1"/>
           <w:bCs w:val="1"/>
           <w:sz w:val="34"/>
           <w:szCs w:val="34"/>
-          <w:rtl w:val="0"/>
-        </w:rPr>
-        <w:t xml:space="preserve">T-039-010 — Magnitud superior a la operación</w:t>
+        </w:rPr>
+      </w:pPr>
+      <w:bookmarkStart w:colFirst="0" w:colLast="0" w:name="_vra1wzcd4jg8" w:id="56"/>
+      <w:bookmarkEnd w:id="56"/>
+      <w:r>
+        <w:rPr>
+          <w:b w:val="1"/>
+          <w:bCs w:val="1"/>
+          <w:sz w:val="34"/>
+          <w:szCs w:val="34"/>
+          <w:rtl w:val="0"/>
+        </w:rPr>
+        <w:t xml:space="preserve">T-039-009 — No mutación</w:t>
+      </w:r>
+    </w:p>
+    <w:p>
+      <w:pPr>
+        <w:spacing w:after="240" w:before="240" w:lineRule="auto"/>
+        <w:rPr/>
+      </w:pPr>
+      <w:r>
+        <w:rPr>
+          <w:rtl w:val="0"/>
+        </w:rPr>
+        <w:t xml:space="preserve">Después de producir una interpretación, la operación y los hechos fuente deberán conservar sus valores contractuales.</w:t>
+      </w:r>
+    </w:p>
+    <w:p>
+      <w:pPr>
+        <w:spacing w:after="240" w:before="240" w:lineRule="auto"/>
+        <w:rPr/>
+      </w:pPr>
+      <w:r>
+        <w:pict>
+          <v:rect style="width:0.0pt;height:1.5pt" o:hr="t" o:hrstd="t" o:hralign="center" fillcolor="#A0A0A0" stroked="f"/>
+        </w:pict>
+      </w:r>
+      <w:r>
+        <w:rPr>
+          <w:rtl w:val="0"/>
+        </w:rPr>
+      </w:r>
+    </w:p>
+    <w:p>
+      <w:pPr>
+        <w:pStyle w:val="Heading2"/>
+        <w:keepNext w:val="0"/>
+        <w:keepLines w:val="0"/>
+        <w:spacing w:after="80" w:lineRule="auto"/>
+        <w:rPr>
+          <w:b w:val="1"/>
+          <w:bCs w:val="1"/>
+          <w:sz w:val="34"/>
+          <w:szCs w:val="34"/>
+        </w:rPr>
+      </w:pPr>
+      <w:bookmarkStart w:colFirst="0" w:colLast="0" w:name="_cwkx3zyk9v9b" w:id="57"/>
+      <w:bookmarkEnd w:id="57"/>
+      <w:r>
+        <w:rPr>
+          <w:b w:val="1"/>
+          <w:bCs w:val="1"/>
+          <w:sz w:val="34"/>
+          <w:szCs w:val="34"/>
+          <w:rtl w:val="0"/>
+        </w:rPr>
+        <w:t xml:space="preserve">T-039-010 — Interpretaciones sucesivas</w:t>
+      </w:r>
+    </w:p>
+    <w:p>
+      <w:pPr>
+        <w:spacing w:after="240" w:before="240" w:lineRule="auto"/>
+        <w:rPr/>
+      </w:pPr>
+      <w:r>
+        <w:rPr>
+          <w:rtl w:val="0"/>
+        </w:rPr>
+        <w:t xml:space="preserve">Dadas:</w:t>
+      </w:r>
+    </w:p>
+    <w:p>
+      <w:pPr>
+        <w:spacing w:after="240" w:before="240" w:lineRule="auto"/>
+        <w:rPr/>
+      </w:pPr>
+      <w:r>
+        <w:rPr>
+          <w:rtl w:val="0"/>
+        </w:rPr>
+        <w:t xml:space="preserve">D1 from {M1}</w:t>
+      </w:r>
+    </w:p>
+    <w:p>
+      <w:pPr>
+        <w:spacing w:after="240" w:before="240" w:lineRule="auto"/>
+        <w:rPr/>
+      </w:pPr>
+      <w:r>
+        <w:rPr>
+          <w:rtl w:val="0"/>
+        </w:rPr>
+        <w:t xml:space="preserve">D2 from {M1, M2}</w:t>
+      </w:r>
+    </w:p>
+    <w:p>
+      <w:pPr>
+        <w:spacing w:after="240" w:before="240" w:lineRule="auto"/>
+        <w:rPr/>
+      </w:pPr>
+      <w:r>
+        <w:rPr>
+          <w:rtl w:val="0"/>
+        </w:rPr>
+      </w:r>
+    </w:p>
+    <w:p>
+      <w:pPr>
+        <w:spacing w:after="240" w:before="240" w:lineRule="auto"/>
+        <w:rPr/>
+      </w:pPr>
+      <w:r>
+        <w:rPr>
+          <w:rtl w:val="0"/>
+        </w:rPr>
+        <w:t xml:space="preserve">deberá demostrarse que D1 conserva su significado original después de construir D2.</w:t>
+      </w:r>
+    </w:p>
+    <w:p>
+      <w:pPr>
+        <w:spacing w:after="240" w:before="240" w:lineRule="auto"/>
+        <w:rPr/>
+      </w:pPr>
+      <w:r>
+        <w:pict>
+          <v:rect style="width:0.0pt;height:1.5pt" o:hr="t" o:hrstd="t" o:hralign="center" fillcolor="#A0A0A0" stroked="f"/>
+        </w:pict>
+      </w:r>
+      <w:r>
+        <w:rPr>
+          <w:rtl w:val="0"/>
+        </w:rPr>
+      </w:r>
+    </w:p>
+    <w:p>
+      <w:pPr>
+        <w:pStyle w:val="Heading2"/>
+        <w:keepNext w:val="0"/>
+        <w:keepLines w:val="0"/>
+        <w:spacing w:after="80" w:lineRule="auto"/>
+        <w:rPr>
+          <w:b w:val="1"/>
+          <w:bCs w:val="1"/>
+          <w:sz w:val="34"/>
+          <w:szCs w:val="34"/>
+        </w:rPr>
+      </w:pPr>
+      <w:bookmarkStart w:colFirst="0" w:colLast="0" w:name="_m8htobx9wjuq" w:id="58"/>
+      <w:bookmarkEnd w:id="58"/>
+      <w:r>
+        <w:rPr>
+          <w:b w:val="1"/>
+          <w:bCs w:val="1"/>
+          <w:sz w:val="34"/>
+          <w:szCs w:val="34"/>
+          <w:rtl w:val="0"/>
+        </w:rPr>
+        <w:t xml:space="preserve">T-039-011 — Magnitud superior a la operación</w:t>
       </w:r>
     </w:p>
     <w:p>
@@ -8468,8 +8567,8 @@
           <w:szCs w:val="46"/>
         </w:rPr>
       </w:pPr>
-      <w:bookmarkStart w:colFirst="0" w:colLast="0" w:name="_n9tm40qpf3oy" w:id="53"/>
-      <w:bookmarkEnd w:id="53"/>
+      <w:bookmarkStart w:colFirst="0" w:colLast="0" w:name="_n9tm40qpf3oy" w:id="59"/>
+      <w:bookmarkEnd w:id="59"/>
       <w:r>
         <w:rPr>
           <w:b w:val="1"/>
@@ -8617,8 +8716,8 @@
           <w:szCs w:val="46"/>
         </w:rPr>
       </w:pPr>
-      <w:bookmarkStart w:colFirst="0" w:colLast="0" w:name="_eylqdra69piw" w:id="54"/>
-      <w:bookmarkEnd w:id="54"/>
+      <w:bookmarkStart w:colFirst="0" w:colLast="0" w:name="_eylqdra69piw" w:id="60"/>
+      <w:bookmarkEnd w:id="60"/>
       <w:r>
         <w:rPr>
           <w:b w:val="1"/>
@@ -8802,8 +8901,8 @@
           <w:szCs w:val="46"/>
         </w:rPr>
       </w:pPr>
-      <w:bookmarkStart w:colFirst="0" w:colLast="0" w:name="_pdia46hls2ew" w:id="55"/>
-      <w:bookmarkEnd w:id="55"/>
+      <w:bookmarkStart w:colFirst="0" w:colLast="0" w:name="_pdia46hls2ew" w:id="61"/>
+      <w:bookmarkEnd w:id="61"/>
       <w:r>
         <w:rPr>
           <w:b w:val="1"/>
@@ -8985,8 +9084,8 @@
           <w:szCs w:val="46"/>
         </w:rPr>
       </w:pPr>
-      <w:bookmarkStart w:colFirst="0" w:colLast="0" w:name="_u4v4axndmixe" w:id="56"/>
-      <w:bookmarkEnd w:id="56"/>
+      <w:bookmarkStart w:colFirst="0" w:colLast="0" w:name="_u4v4axndmixe" w:id="62"/>
+      <w:bookmarkEnd w:id="62"/>
       <w:r>
         <w:rPr>
           <w:b w:val="1"/>
@@ -9099,7 +9198,7 @@
         <w:rPr>
           <w:rtl w:val="0"/>
         </w:rPr>
-        <w:t xml:space="preserve">Si dos caminos anteriores producen los mismos contratos de entrada, DOC-039 deberá poder producir la misma interpretación semántica.</w:t>
+        <w:t xml:space="preserve">Si dos caminos anteriores producen los mismos contratos de entrada, la responsabilidad deberá poder producir la misma interpretación semántica.</w:t>
       </w:r>
     </w:p>
     <w:p>
@@ -9131,8 +9230,8 @@
           <w:szCs w:val="46"/>
         </w:rPr>
       </w:pPr>
-      <w:bookmarkStart w:colFirst="0" w:colLast="0" w:name="_8ovbp1qa44as" w:id="57"/>
-      <w:bookmarkEnd w:id="57"/>
+      <w:bookmarkStart w:colFirst="0" w:colLast="0" w:name="_8ovbp1qa44as" w:id="63"/>
+      <w:bookmarkEnd w:id="63"/>
       <w:r>
         <w:rPr>
           <w:b w:val="1"/>
@@ -9245,7 +9344,7 @@
         <w:rPr>
           <w:rtl w:val="0"/>
         </w:rPr>
-        <w:t xml:space="preserve">El incremento no deberá degradar Capabilities anteriores.</w:t>
+        <w:t xml:space="preserve">El incremento no deberá degradar contratos ni responsabilidades anteriores.</w:t>
       </w:r>
     </w:p>
     <w:p>
@@ -9277,8 +9376,8 @@
           <w:szCs w:val="46"/>
         </w:rPr>
       </w:pPr>
-      <w:bookmarkStart w:colFirst="0" w:colLast="0" w:name="_mr9nlxlh45i0" w:id="58"/>
-      <w:bookmarkEnd w:id="58"/>
+      <w:bookmarkStart w:colFirst="0" w:colLast="0" w:name="_mr9nlxlh45i0" w:id="64"/>
+      <w:bookmarkEnd w:id="64"/>
       <w:r>
         <w:rPr>
           <w:b w:val="1"/>
@@ -9555,8 +9654,8 @@
           <w:szCs w:val="46"/>
         </w:rPr>
       </w:pPr>
-      <w:bookmarkStart w:colFirst="0" w:colLast="0" w:name="_tv0gsmn4rovs" w:id="59"/>
-      <w:bookmarkEnd w:id="59"/>
+      <w:bookmarkStart w:colFirst="0" w:colLast="0" w:name="_tv0gsmn4rovs" w:id="65"/>
+      <w:bookmarkEnd w:id="65"/>
       <w:r>
         <w:rPr>
           <w:b w:val="1"/>
@@ -10077,7 +10176,7 @@
         <w:rPr>
           <w:rtl w:val="0"/>
         </w:rPr>
-        <w:t xml:space="preserve">identidad contractual de ocurrencia;</w:t>
+        <w:t xml:space="preserve">creación o redefinición de identidad contractual de ocurrencia;</w:t>
       </w:r>
     </w:p>
     <w:p>
@@ -10093,7 +10192,7 @@
         <w:rPr>
           <w:rtl w:val="0"/>
         </w:rPr>
-        <w:t xml:space="preserve">deduplicación contractual;</w:t>
+        <w:t xml:space="preserve">deduplicación operacional o subsistema de deduplicación;</w:t>
       </w:r>
     </w:p>
     <w:p>
@@ -10157,8 +10256,8 @@
           <w:szCs w:val="46"/>
         </w:rPr>
       </w:pPr>
-      <w:bookmarkStart w:colFirst="0" w:colLast="0" w:name="_6f3etp6ntz9b" w:id="60"/>
-      <w:bookmarkEnd w:id="60"/>
+      <w:bookmarkStart w:colFirst="0" w:colLast="0" w:name="_6f3etp6ntz9b" w:id="66"/>
+      <w:bookmarkEnd w:id="66"/>
       <w:r>
         <w:rPr>
           <w:b w:val="1"/>
@@ -10179,7 +10278,12 @@
         <w:rPr>
           <w:rtl w:val="0"/>
         </w:rPr>
-        <w:t xml:space="preserve">IT-039-001 será aceptado únicamente si se cumplen conjuntamente:</w:t>
+        <w:t xml:space="preserve">IT-039-001 v1.1 será aceptado únicamente si se cumplen conjuntamente:</w:t>
+      </w:r>
+      <w:r>
+        <w:rPr>
+          <w:rtl w:val="0"/>
+        </w:rPr>
       </w:r>
     </w:p>
     <w:p>
@@ -10196,8 +10300,8 @@
           <w:szCs w:val="26"/>
         </w:rPr>
       </w:pPr>
-      <w:bookmarkStart w:colFirst="0" w:colLast="0" w:name="_bjwq96xwrem" w:id="61"/>
-      <w:bookmarkEnd w:id="61"/>
+      <w:bookmarkStart w:colFirst="0" w:colLast="0" w:name="_bjwq96xwrem" w:id="67"/>
+      <w:bookmarkEnd w:id="67"/>
       <w:r>
         <w:rPr>
           <w:b w:val="1"/>
@@ -10250,8 +10354,8 @@
           <w:szCs w:val="26"/>
         </w:rPr>
       </w:pPr>
-      <w:bookmarkStart w:colFirst="0" w:colLast="0" w:name="_pnw9rzgi8ola" w:id="62"/>
-      <w:bookmarkEnd w:id="62"/>
+      <w:bookmarkStart w:colFirst="0" w:colLast="0" w:name="_pnw9rzgi8ola" w:id="68"/>
+      <w:bookmarkEnd w:id="68"/>
       <w:r>
         <w:rPr>
           <w:b w:val="1"/>
@@ -10304,8 +10408,8 @@
           <w:szCs w:val="26"/>
         </w:rPr>
       </w:pPr>
-      <w:bookmarkStart w:colFirst="0" w:colLast="0" w:name="_3i8gimxfi4n3" w:id="63"/>
-      <w:bookmarkEnd w:id="63"/>
+      <w:bookmarkStart w:colFirst="0" w:colLast="0" w:name="_3i8gimxfi4n3" w:id="69"/>
+      <w:bookmarkEnd w:id="69"/>
       <w:r>
         <w:rPr>
           <w:b w:val="1"/>
@@ -10372,8 +10476,8 @@
           <w:szCs w:val="26"/>
         </w:rPr>
       </w:pPr>
-      <w:bookmarkStart w:colFirst="0" w:colLast="0" w:name="_ukw662oz7ubr" w:id="64"/>
-      <w:bookmarkEnd w:id="64"/>
+      <w:bookmarkStart w:colFirst="0" w:colLast="0" w:name="_ukw662oz7ubr" w:id="70"/>
+      <w:bookmarkEnd w:id="70"/>
       <w:r>
         <w:rPr>
           <w:b w:val="1"/>
@@ -10395,21 +10499,7 @@
         <w:rPr>
           <w:rtl w:val="0"/>
         </w:rPr>
-        <w:t xml:space="preserve">La interpretación requiere uno o más </w:t>
-      </w:r>
-      <w:r>
-        <w:rPr>
-          <w:rFonts w:ascii="Roboto Mono" w:cs="Roboto Mono" w:eastAsia="Roboto Mono" w:hAnsi="Roboto Mono"/>
-          <w:color w:val="188038"/>
-          <w:rtl w:val="0"/>
-        </w:rPr>
-        <w:t xml:space="preserve">OperationalMaterialization</w:t>
-      </w:r>
-      <w:r>
-        <w:rPr>
-          <w:rtl w:val="0"/>
-        </w:rPr>
-        <w:t xml:space="preserve">.</w:t>
+        <w:t xml:space="preserve">La interpretación requiere uno o más OperationalMaterialization con occurrence_id distintos.</w:t>
       </w:r>
     </w:p>
     <w:p>
@@ -10426,8 +10516,8 @@
           <w:szCs w:val="26"/>
         </w:rPr>
       </w:pPr>
-      <w:bookmarkStart w:colFirst="0" w:colLast="0" w:name="_cmy24q8ki9o6" w:id="65"/>
-      <w:bookmarkEnd w:id="65"/>
+      <w:bookmarkStart w:colFirst="0" w:colLast="0" w:name="_cmy24q8ki9o6" w:id="71"/>
+      <w:bookmarkEnd w:id="71"/>
       <w:r>
         <w:rPr>
           <w:b w:val="1"/>
@@ -10466,8 +10556,8 @@
           <w:szCs w:val="26"/>
         </w:rPr>
       </w:pPr>
-      <w:bookmarkStart w:colFirst="0" w:colLast="0" w:name="_igay0eh95t5y" w:id="66"/>
-      <w:bookmarkEnd w:id="66"/>
+      <w:bookmarkStart w:colFirst="0" w:colLast="0" w:name="_igay0eh95t5y" w:id="72"/>
+      <w:bookmarkEnd w:id="72"/>
       <w:r>
         <w:rPr>
           <w:b w:val="1"/>
@@ -10506,8 +10596,8 @@
           <w:szCs w:val="26"/>
         </w:rPr>
       </w:pPr>
-      <w:bookmarkStart w:colFirst="0" w:colLast="0" w:name="_io80wvikj7l2" w:id="67"/>
-      <w:bookmarkEnd w:id="67"/>
+      <w:bookmarkStart w:colFirst="0" w:colLast="0" w:name="_io80wvikj7l2" w:id="73"/>
+      <w:bookmarkEnd w:id="73"/>
       <w:r>
         <w:rPr>
           <w:b w:val="1"/>
@@ -10546,8 +10636,8 @@
           <w:szCs w:val="26"/>
         </w:rPr>
       </w:pPr>
-      <w:bookmarkStart w:colFirst="0" w:colLast="0" w:name="_83c41uespkan" w:id="68"/>
-      <w:bookmarkEnd w:id="68"/>
+      <w:bookmarkStart w:colFirst="0" w:colLast="0" w:name="_83c41uespkan" w:id="74"/>
+      <w:bookmarkEnd w:id="74"/>
       <w:r>
         <w:rPr>
           <w:b w:val="1"/>
@@ -10586,8 +10676,8 @@
           <w:szCs w:val="26"/>
         </w:rPr>
       </w:pPr>
-      <w:bookmarkStart w:colFirst="0" w:colLast="0" w:name="_jrc52ekj1r1z" w:id="69"/>
-      <w:bookmarkEnd w:id="69"/>
+      <w:bookmarkStart w:colFirst="0" w:colLast="0" w:name="_jrc52ekj1r1z" w:id="75"/>
+      <w:bookmarkEnd w:id="75"/>
       <w:r>
         <w:rPr>
           <w:b w:val="1"/>
@@ -10626,8 +10716,8 @@
           <w:szCs w:val="26"/>
         </w:rPr>
       </w:pPr>
-      <w:bookmarkStart w:colFirst="0" w:colLast="0" w:name="_jvoww6mxb4o" w:id="70"/>
-      <w:bookmarkEnd w:id="70"/>
+      <w:bookmarkStart w:colFirst="0" w:colLast="0" w:name="_jvoww6mxb4o" w:id="76"/>
+      <w:bookmarkEnd w:id="76"/>
       <w:r>
         <w:rPr>
           <w:b w:val="1"/>
@@ -10649,7 +10739,12 @@
         <w:rPr>
           <w:rtl w:val="0"/>
         </w:rPr>
-        <w:t xml:space="preserve">Las incompatibilidades propias se expresan mediante error de dominio de la Capability.</w:t>
+        <w:t xml:space="preserve">Las incompatibilidades propias se expresan mediante OperationalMaterializationInterpretationDomainError.</w:t>
+      </w:r>
+      <w:r>
+        <w:rPr>
+          <w:rtl w:val="0"/>
+        </w:rPr>
       </w:r>
     </w:p>
     <w:p>
@@ -10666,8 +10761,8 @@
           <w:szCs w:val="26"/>
         </w:rPr>
       </w:pPr>
-      <w:bookmarkStart w:colFirst="0" w:colLast="0" w:name="_egxw4k3g2n5l" w:id="71"/>
-      <w:bookmarkEnd w:id="71"/>
+      <w:bookmarkStart w:colFirst="0" w:colLast="0" w:name="_egxw4k3g2n5l" w:id="77"/>
+      <w:bookmarkEnd w:id="77"/>
       <w:r>
         <w:rPr>
           <w:b w:val="1"/>
@@ -10720,8 +10815,8 @@
           <w:szCs w:val="26"/>
         </w:rPr>
       </w:pPr>
-      <w:bookmarkStart w:colFirst="0" w:colLast="0" w:name="_7mspnpfc3lv2" w:id="72"/>
-      <w:bookmarkEnd w:id="72"/>
+      <w:bookmarkStart w:colFirst="0" w:colLast="0" w:name="_7mspnpfc3lv2" w:id="78"/>
+      <w:bookmarkEnd w:id="78"/>
       <w:r>
         <w:rPr>
           <w:b w:val="1"/>
@@ -10760,8 +10855,8 @@
           <w:szCs w:val="26"/>
         </w:rPr>
       </w:pPr>
-      <w:bookmarkStart w:colFirst="0" w:colLast="0" w:name="_a63mtnhhk6dg" w:id="73"/>
-      <w:bookmarkEnd w:id="73"/>
+      <w:bookmarkStart w:colFirst="0" w:colLast="0" w:name="_a63mtnhhk6dg" w:id="79"/>
+      <w:bookmarkEnd w:id="79"/>
       <w:r>
         <w:rPr>
           <w:b w:val="1"/>
@@ -10814,8 +10909,8 @@
           <w:szCs w:val="26"/>
         </w:rPr>
       </w:pPr>
-      <w:bookmarkStart w:colFirst="0" w:colLast="0" w:name="_hj0f64sembt4" w:id="74"/>
-      <w:bookmarkEnd w:id="74"/>
+      <w:bookmarkStart w:colFirst="0" w:colLast="0" w:name="_hj0f64sembt4" w:id="80"/>
+      <w:bookmarkEnd w:id="80"/>
       <w:r>
         <w:rPr>
           <w:b w:val="1"/>
@@ -10854,8 +10949,8 @@
           <w:szCs w:val="26"/>
         </w:rPr>
       </w:pPr>
-      <w:bookmarkStart w:colFirst="0" w:colLast="0" w:name="_jjnchcxkpsft" w:id="75"/>
-      <w:bookmarkEnd w:id="75"/>
+      <w:bookmarkStart w:colFirst="0" w:colLast="0" w:name="_jjnchcxkpsft" w:id="81"/>
+      <w:bookmarkEnd w:id="81"/>
       <w:r>
         <w:rPr>
           <w:b w:val="1"/>
@@ -10894,8 +10989,8 @@
           <w:szCs w:val="26"/>
         </w:rPr>
       </w:pPr>
-      <w:bookmarkStart w:colFirst="0" w:colLast="0" w:name="_3m6jz2987j90" w:id="76"/>
-      <w:bookmarkEnd w:id="76"/>
+      <w:bookmarkStart w:colFirst="0" w:colLast="0" w:name="_3m6jz2987j90" w:id="82"/>
+      <w:bookmarkEnd w:id="82"/>
       <w:r>
         <w:rPr>
           <w:b w:val="1"/>
@@ -10934,8 +11029,8 @@
           <w:szCs w:val="26"/>
         </w:rPr>
       </w:pPr>
-      <w:bookmarkStart w:colFirst="0" w:colLast="0" w:name="_nlmtapffn989" w:id="77"/>
-      <w:bookmarkEnd w:id="77"/>
+      <w:bookmarkStart w:colFirst="0" w:colLast="0" w:name="_nlmtapffn989" w:id="83"/>
+      <w:bookmarkEnd w:id="83"/>
       <w:r>
         <w:rPr>
           <w:b w:val="1"/>
@@ -10958,6 +11053,48 @@
           <w:rtl w:val="0"/>
         </w:rPr>
         <w:t xml:space="preserve">No se requiere infraestructura productiva.</w:t>
+      </w:r>
+    </w:p>
+    <w:p>
+      <w:pPr>
+        <w:spacing w:after="240" w:before="240" w:lineRule="auto"/>
+        <w:rPr>
+          <w:b w:val="1"/>
+          <w:bCs w:val="1"/>
+          <w:sz w:val="26"/>
+          <w:szCs w:val="26"/>
+        </w:rPr>
+      </w:pPr>
+      <w:r>
+        <w:rPr>
+          <w:b w:val="1"/>
+          <w:bCs w:val="1"/>
+          <w:sz w:val="26"/>
+          <w:szCs w:val="26"/>
+          <w:rtl w:val="0"/>
+        </w:rPr>
+        <w:t xml:space="preserve">AC-039-018</w:t>
+      </w:r>
+    </w:p>
+    <w:p>
+      <w:pPr>
+        <w:spacing w:after="240" w:before="240" w:lineRule="auto"/>
+        <w:rPr/>
+      </w:pPr>
+      <w:r>
+        <w:rPr>
+          <w:b w:val="1"/>
+          <w:bCs w:val="1"/>
+          <w:sz w:val="26"/>
+          <w:szCs w:val="26"/>
+          <w:rtl w:val="0"/>
+        </w:rPr>
+        <w:t xml:space="preserve">No se crea ni redefine identidad de ocurrencia. Los hechos fuente de una interpretación poseen occurrence_id distintos; una identidad repetida produce error de dominio y no deduplicación silenciosa.</w:t>
+      </w:r>
+      <w:r>
+        <w:rPr>
+          <w:rtl w:val="0"/>
+        </w:rPr>
       </w:r>
     </w:p>
     <w:p>
@@ -10974,8 +11111,8 @@
           <w:szCs w:val="26"/>
         </w:rPr>
       </w:pPr>
-      <w:bookmarkStart w:colFirst="0" w:colLast="0" w:name="_xfi21vioa10q" w:id="78"/>
-      <w:bookmarkEnd w:id="78"/>
+      <w:bookmarkStart w:colFirst="0" w:colLast="0" w:name="_kr6g3j7styzi" w:id="84"/>
+      <w:bookmarkEnd w:id="84"/>
       <w:r>
         <w:rPr>
           <w:b w:val="1"/>
@@ -10985,19 +11122,19 @@
           <w:szCs w:val="26"/>
           <w:rtl w:val="0"/>
         </w:rPr>
-        <w:t xml:space="preserve">AC-039-018</w:t>
-      </w:r>
-    </w:p>
-    <w:p>
-      <w:pPr>
-        <w:spacing w:after="240" w:before="240" w:lineRule="auto"/>
-        <w:rPr/>
-      </w:pPr>
-      <w:r>
-        <w:rPr>
-          <w:rtl w:val="0"/>
-        </w:rPr>
-        <w:t xml:space="preserve">No se introduce identidad de ocurrencia ni deduplicación contractual.</w:t>
+        <w:t xml:space="preserve">AC-039-019</w:t>
+      </w:r>
+    </w:p>
+    <w:p>
+      <w:pPr>
+        <w:spacing w:after="240" w:before="240" w:lineRule="auto"/>
+        <w:rPr/>
+      </w:pPr>
+      <w:r>
+        <w:rPr>
+          <w:rtl w:val="0"/>
+        </w:rPr>
+        <w:t xml:space="preserve">Las APIs públicas anteriores mantienen su semántica.</w:t>
       </w:r>
     </w:p>
     <w:p>
@@ -11014,48 +11151,8 @@
           <w:szCs w:val="26"/>
         </w:rPr>
       </w:pPr>
-      <w:bookmarkStart w:colFirst="0" w:colLast="0" w:name="_kr6g3j7styzi" w:id="79"/>
-      <w:bookmarkEnd w:id="79"/>
-      <w:r>
-        <w:rPr>
-          <w:b w:val="1"/>
-          <w:bCs w:val="1"/>
-          <w:color w:val="000000"/>
-          <w:sz w:val="26"/>
-          <w:szCs w:val="26"/>
-          <w:rtl w:val="0"/>
-        </w:rPr>
-        <w:t xml:space="preserve">AC-039-019</w:t>
-      </w:r>
-    </w:p>
-    <w:p>
-      <w:pPr>
-        <w:spacing w:after="240" w:before="240" w:lineRule="auto"/>
-        <w:rPr/>
-      </w:pPr>
-      <w:r>
-        <w:rPr>
-          <w:rtl w:val="0"/>
-        </w:rPr>
-        <w:t xml:space="preserve">Las APIs públicas anteriores mantienen su semántica.</w:t>
-      </w:r>
-    </w:p>
-    <w:p>
-      <w:pPr>
-        <w:pStyle w:val="Heading3"/>
-        <w:keepNext w:val="0"/>
-        <w:keepLines w:val="0"/>
-        <w:spacing w:before="280" w:lineRule="auto"/>
-        <w:rPr>
-          <w:b w:val="1"/>
-          <w:bCs w:val="1"/>
-          <w:color w:val="000000"/>
-          <w:sz w:val="26"/>
-          <w:szCs w:val="26"/>
-        </w:rPr>
-      </w:pPr>
-      <w:bookmarkStart w:colFirst="0" w:colLast="0" w:name="_iqvxg1e36yxi" w:id="80"/>
-      <w:bookmarkEnd w:id="80"/>
+      <w:bookmarkStart w:colFirst="0" w:colLast="0" w:name="_iqvxg1e36yxi" w:id="85"/>
+      <w:bookmarkEnd w:id="85"/>
       <w:r>
         <w:rPr>
           <w:b w:val="1"/>
@@ -11109,8 +11206,8 @@
           <w:szCs w:val="46"/>
         </w:rPr>
       </w:pPr>
-      <w:bookmarkStart w:colFirst="0" w:colLast="0" w:name="_4xfetqd7p2oj" w:id="81"/>
-      <w:bookmarkEnd w:id="81"/>
+      <w:bookmarkStart w:colFirst="0" w:colLast="0" w:name="_4xfetqd7p2oj" w:id="86"/>
+      <w:bookmarkEnd w:id="86"/>
       <w:r>
         <w:rPr>
           <w:b w:val="1"/>
@@ -11131,21 +11228,12 @@
         <w:rPr>
           <w:rtl w:val="0"/>
         </w:rPr>
-        <w:t xml:space="preserve">IT-039-001 estará </w:t>
-      </w:r>
-      <w:r>
-        <w:rPr>
-          <w:b w:val="1"/>
-          <w:bCs w:val="1"/>
-          <w:rtl w:val="0"/>
-        </w:rPr>
-        <w:t xml:space="preserve">DONE</w:t>
-      </w:r>
-      <w:r>
-        <w:rPr>
-          <w:rtl w:val="0"/>
-        </w:rPr>
-        <w:t xml:space="preserve"> cuando:</w:t>
+        <w:t xml:space="preserve">IT-039-001 v1.1 estará DONE cuando:</w:t>
+      </w:r>
+      <w:r>
+        <w:rPr>
+          <w:rtl w:val="0"/>
+        </w:rPr>
       </w:r>
     </w:p>
     <w:p>
@@ -11625,25 +11713,7 @@
           <w:bCs w:val="1"/>
           <w:rtl w:val="0"/>
         </w:rPr>
-        <w:t xml:space="preserve">, a partir de uno o más </w:t>
-      </w:r>
-      <w:r>
-        <w:rPr>
-          <w:rFonts w:ascii="Roboto Mono" w:cs="Roboto Mono" w:eastAsia="Roboto Mono" w:hAnsi="Roboto Mono"/>
-          <w:b w:val="1"/>
-          <w:bCs w:val="1"/>
-          <w:color w:val="188038"/>
-          <w:rtl w:val="0"/>
-        </w:rPr>
-        <w:t xml:space="preserve">OperationalMaterialization</w:t>
-      </w:r>
-      <w:r>
-        <w:rPr>
-          <w:b w:val="1"/>
-          <w:bCs w:val="1"/>
-          <w:rtl w:val="0"/>
-        </w:rPr>
-        <w:t xml:space="preserve"> reconocidos suministrados, sin asumir todavía qué significa esa magnitud para completitud, Portfolio, reconciliación o cualquier consecuencia posterior.</w:t>
+        <w:t xml:space="preserve">, a partir de uno o más OperationalMaterialization con occurrence_id distintos reconocidos suministrados, sin asumir todavía qué significa esa magnitud para completitud, Portfolio, reconciliación o cualquier consecuencia posterior.</w:t>
       </w:r>
     </w:p>
     <w:p>
@@ -11675,8 +11745,8 @@
           <w:szCs w:val="46"/>
         </w:rPr>
       </w:pPr>
-      <w:bookmarkStart w:colFirst="0" w:colLast="0" w:name="_nm7cxmxqjfja" w:id="82"/>
-      <w:bookmarkEnd w:id="82"/>
+      <w:bookmarkStart w:colFirst="0" w:colLast="0" w:name="_nm7cxmxqjfja" w:id="87"/>
+      <w:bookmarkEnd w:id="87"/>
       <w:r>
         <w:rPr>
           <w:b w:val="1"/>
@@ -11685,7 +11755,7 @@
           <w:szCs w:val="46"/>
           <w:rtl w:val="0"/>
         </w:rPr>
-        <w:t xml:space="preserve">44. Criterio de cierre de DOC-039 después del IT</w:t>
+        <w:t xml:space="preserve">44. Criterio de cierre del incremento recuperado</w:t>
       </w:r>
     </w:p>
     <w:p>
@@ -11715,50 +11785,36 @@
           <w:bCs w:val="1"/>
           <w:rtl w:val="0"/>
         </w:rPr>
-        <w:t xml:space="preserve">¿IT-039-001 materializa completamente la responsabilidad prometida por DOC-039, o permanece alguna obligación contractual de Operational Materialization Interpretation todavía sin implementación?</w:t>
-      </w:r>
-    </w:p>
-    <w:p>
-      <w:pPr>
-        <w:spacing w:after="240" w:before="240" w:lineRule="auto"/>
-        <w:rPr/>
-      </w:pPr>
-      <w:r>
-        <w:rPr>
-          <w:rtl w:val="0"/>
-        </w:rPr>
-        <w:t xml:space="preserve">La auditoría de cierre no deberá presumir la necesidad de un incremento técnico adicional bajo DOC-039. </w:t>
-      </w:r>
-      <w:r>
-        <w:rPr>
-          <w:rtl w:val="0"/>
-        </w:rPr>
-      </w:r>
-    </w:p>
-    <w:p>
-      <w:pPr>
-        <w:spacing w:after="240" w:before="240" w:lineRule="auto"/>
-        <w:rPr/>
-      </w:pPr>
-      <w:r>
-        <w:rPr>
-          <w:rtl w:val="0"/>
-        </w:rPr>
-        <w:t xml:space="preserve">Si IT-039-001 satisface completamente DOC-039, la Capability deberá cerrarse para su alcance y el siguiente ciclo deberá buscar la siguiente responsabilidad necesaria después de </w:t>
-      </w:r>
-      <w:r>
-        <w:rPr>
-          <w:rFonts w:ascii="Roboto Mono" w:cs="Roboto Mono" w:eastAsia="Roboto Mono" w:hAnsi="Roboto Mono"/>
-          <w:color w:val="188038"/>
-          <w:rtl w:val="0"/>
-        </w:rPr>
-        <w:t xml:space="preserve">OperationalMaterializationInterpretation</w:t>
-      </w:r>
-      <w:r>
-        <w:rPr>
-          <w:rtl w:val="0"/>
-        </w:rPr>
-        <w:t xml:space="preserve">.</w:t>
+        <w:t xml:space="preserve">¿IT-039-001 v1.1 materializa completamente la responsabilidad de Materialization Interpretation recuperada dentro de Execution, o permanece alguna obligación contractual de esta responsabilidad todavía sin implementación?</w:t>
+      </w:r>
+    </w:p>
+    <w:p>
+      <w:pPr>
+        <w:spacing w:after="240" w:before="240" w:lineRule="auto"/>
+        <w:rPr/>
+      </w:pPr>
+      <w:r>
+        <w:rPr>
+          <w:rtl w:val="0"/>
+        </w:rPr>
+        <w:t xml:space="preserve">La auditoría de cierre no deberá presumir la necesidad de un incremento técnico adicional para esta responsabilidad. </w:t>
+      </w:r>
+      <w:r>
+        <w:rPr>
+          <w:rtl w:val="0"/>
+        </w:rPr>
+      </w:r>
+    </w:p>
+    <w:p>
+      <w:pPr>
+        <w:spacing w:after="240" w:before="240" w:lineRule="auto"/>
+        <w:rPr/>
+      </w:pPr>
+      <w:r>
+        <w:rPr>
+          <w:rtl w:val="0"/>
+        </w:rPr>
+        <w:t xml:space="preserve">Si IT-039-001 v1.1 satisface completamente esta responsabilidad, el incremento deberá cerrarse y el siguiente ciclo deberá buscar la siguiente responsabilidad demostrablemente necesaria dentro de Execution después de OperationalMaterializationInterpretation.</w:t>
       </w:r>
     </w:p>
     <w:p>
@@ -11790,8 +11846,8 @@
           <w:szCs w:val="46"/>
         </w:rPr>
       </w:pPr>
-      <w:bookmarkStart w:colFirst="0" w:colLast="0" w:name="_g03pndw3yhn5" w:id="83"/>
-      <w:bookmarkEnd w:id="83"/>
+      <w:bookmarkStart w:colFirst="0" w:colLast="0" w:name="_g03pndw3yhn5" w:id="88"/>
+      <w:bookmarkEnd w:id="88"/>
       <w:r>
         <w:rPr>
           <w:b w:val="1"/>
@@ -11816,8 +11872,8 @@
           <w:szCs w:val="34"/>
         </w:rPr>
       </w:pPr>
-      <w:bookmarkStart w:colFirst="0" w:colLast="0" w:name="_7gl9lrgifhrm" w:id="84"/>
-      <w:bookmarkEnd w:id="84"/>
+      <w:bookmarkStart w:colFirst="0" w:colLast="0" w:name="_7gl9lrgifhrm" w:id="89"/>
+      <w:bookmarkEnd w:id="89"/>
       <w:r>
         <w:rPr>
           <w:b w:val="1"/>
@@ -11826,30 +11882,7 @@
           <w:szCs w:val="34"/>
           <w:rtl w:val="0"/>
         </w:rPr>
-        <w:t xml:space="preserve">IT-039-001 — </w:t>
-      </w:r>
-      <w:r>
-        <w:rPr>
-          <w:b w:val="1"/>
-          <w:bCs w:val="1"/>
-          <w:sz w:val="22"/>
-          <w:szCs w:val="22"/>
-          <w:rtl w:val="0"/>
-        </w:rPr>
-        <w:t xml:space="preserve"> </w:t>
-      </w:r>
-      <w:r>
-        <w:rPr>
-          <w:sz w:val="22"/>
-          <w:szCs w:val="22"/>
-          <w:rtl w:val="0"/>
-        </w:rPr>
-        <w:t xml:space="preserve">APPROVED </w:t>
-      </w:r>
-      <w:r>
-        <w:rPr>
-          <w:rtl w:val="0"/>
-        </w:rPr>
+        <w:t xml:space="preserve">IT-039-001 v1.1 — READY FOR IMPLEMENTATION </w:t>
       </w:r>
     </w:p>
     <w:p>

</xml_diff>